<commit_message>
fix and feat: fixed github link, added tracelog link
</commit_message>
<xml_diff>
--- a/LR1/report_PR2.docx
+++ b/LR1/report_PR2.docx
@@ -1218,7 +1218,7 @@
             <w:szCs w:val="28"/>
             <w:lang w:val="en-US"/>
           </w:rPr>
-          <w:t>https://github.com/bumajnici/C_Labs/blob/main/MathCalculations.c</w:t>
+          <w:t>https://github.com/bumajnici/C_Labs/tree/main/LR1</w:t>
         </w:r>
       </w:hyperlink>
     </w:p>
@@ -1231,6 +1231,7 @@
           <w:rFonts w:ascii="Times New Roman" w:hAnsi="Times New Roman" w:cs="Times New Roman"/>
           <w:sz w:val="28"/>
           <w:szCs w:val="28"/>
+          <w:lang w:val="en-US"/>
         </w:rPr>
       </w:pPr>
     </w:p>
@@ -1339,6 +1340,17 @@
           <w:szCs w:val="28"/>
         </w:rPr>
       </w:pPr>
+      <w:hyperlink r:id="rId6" w:history="1">
+        <w:r>
+          <w:rPr>
+            <w:rStyle w:val="a5"/>
+            <w:rFonts w:ascii="Times New Roman" w:hAnsi="Times New Roman" w:cs="Times New Roman"/>
+            <w:sz w:val="28"/>
+            <w:szCs w:val="28"/>
+          </w:rPr>
+          <w:t>https://github.com/bumajnici/C_Labs/blob/main/LR1/SWV_export/SWV_Trace_Log.txt</w:t>
+        </w:r>
+      </w:hyperlink>
     </w:p>
     <w:p>
       <w:pPr>

</xml_diff>